<commit_message>
chore(tm): roll out the all-on v3.5 records (37+3 deliverables, evidence 0008-0011)
</commit_message>
<xml_diff>
--- a/协作/01-项目画像.docx
+++ b/协作/01-项目画像.docx
@@ -7,7 +7,7 @@
         <w:pStyle w:val="Title"/>
       </w:pPr>
       <w:r>
-        <w:t>项目画像 DCG</w:t>
+        <w:t>项目画像</w:t>
       </w:r>
     </w:p>
     <w:tbl>
@@ -37,7 +37,7 @@
           </w:tcPr>
           <w:p>
             <w:r>
-              <w:t>v1</w:t>
+              <w:t>v3.5</w:t>
             </w:r>
           </w:p>
         </w:tc>
@@ -103,7 +103,7 @@
           </w:tcPr>
           <w:p>
             <w:r>
-              <w:t>全部</w:t>
+              <w:t>切片-0003</w:t>
             </w:r>
           </w:p>
         </w:tc>
@@ -131,48 +131,37 @@
         </w:tc>
       </w:tr>
     </w:tbl>
-    <w:p/>
     <w:p>
       <w:pPr>
         <w:pStyle w:val="Heading1"/>
       </w:pPr>
       <w:r>
-        <w:t>1. 基本信息</w:t>
+        <w:t>1. 项目基本信息</w:t>
       </w:r>
     </w:p>
     <w:p>
       <w:r>
-        <w:t>项目名称：DCG（Data Config Generator）</w:t>
+        <w:t>项目名称：DCG（Data Config Generator）。一句话：以 schema 定义驱动生成与迁移配置数据的 Python 库，含 IR、代码生成、运行时与迁移工具。</w:t>
       </w:r>
     </w:p>
     <w:p>
       <w:r>
-        <w:t>一句话说明：把一份 JSON 配置编译成定制、零依赖的 Python transform 函数。</w:t>
+        <w:t>技术栈：Python &gt;= 3.10，运行时零第三方依赖；测试用 pytest；构建用 python -m build。</w:t>
       </w:r>
     </w:p>
     <w:p>
       <w:r>
-        <w:t>技术栈：Python ≥ 3.10；打包 setuptools；运行时零第三方依赖（dev 依赖 pytest / jsonata / Cython 可选）。</w:t>
+        <w:t>仓库根目录：C:\Users\black\Desktop\DCG；远端 https://github.com/CL98K/DCG.git，分支 main。</w:t>
       </w:r>
     </w:p>
     <w:p>
       <w:r>
-        <w:t>仓库根目录：C:\Users\black\Desktop\DCG（远端 https://github.com/CL98K/DCG.git，分支 main）</w:t>
+        <w:t>协作目录：协作/。</w:t>
       </w:r>
     </w:p>
     <w:p>
       <w:r>
-        <w:t>协作目录：协作/</w:t>
-      </w:r>
-    </w:p>
-    <w:p>
-      <w:r>
-        <w:t>角色档位：单人（负责人可由实现兼任；审查结论必须来自独立的一轮复读或另一次执行）</w:t>
-      </w:r>
-    </w:p>
-    <w:p>
-      <w:r>
-        <w:t>当前阶段：P0（只启用 G0/G1/G6）</w:t>
+        <w:t>当前状态：全角色全开（九角色 + 九门禁 + 37 份编号交付物 + 3 份附件清单），无档位、无开关、无可选项。</w:t>
       </w:r>
     </w:p>
     <w:p>
@@ -184,26 +173,41 @@
       </w:r>
     </w:p>
     <w:p>
+      <w:pPr>
+        <w:pStyle w:val="ListBullet"/>
+      </w:pPr>
       <w:r>
         <w:t>构建：python -m build</w:t>
       </w:r>
     </w:p>
     <w:p>
+      <w:pPr>
+        <w:pStyle w:val="ListBullet"/>
+      </w:pPr>
       <w:r>
-        <w:t>单元测试：python -m pytest tests/ -q</w:t>
+        <w:t>单元测试：python -m pytest tests/ -p no:cacheprovider（基线 696 passed）</w:t>
       </w:r>
     </w:p>
     <w:p>
+      <w:pPr>
+        <w:pStyle w:val="ListBullet"/>
+      </w:pPr>
       <w:r>
-        <w:t>验收测试：python evidence/accept.py（退出码 0 = 全部门禁 PASS）</w:t>
+        <w:t>独立验收门禁：python evidence/accept.py（基线 16 PASS / 0 FAIL / 0 SKIP）</w:t>
       </w:r>
     </w:p>
     <w:p>
+      <w:pPr>
+        <w:pStyle w:val="ListBullet"/>
+      </w:pPr>
       <w:r>
-        <w:t>静态检查：无（仅 pytest 的 filterwarnings=error::SyntaxWarning）</w:t>
+        <w:t>静态检查：未配置 linter（不设门禁，仅人工）</w:t>
       </w:r>
     </w:p>
     <w:p>
+      <w:pPr>
+        <w:pStyle w:val="ListBullet"/>
+      </w:pPr>
       <w:r>
         <w:t>打包：python -m build</w:t>
       </w:r>
@@ -217,28 +221,43 @@
       </w:r>
     </w:p>
     <w:p>
+      <w:pPr>
+        <w:pStyle w:val="ListBullet"/>
+      </w:pPr>
       <w:r>
-        <w:t>源码：dcg/**（含 dcg/jx/**）</w:t>
+        <w:t>源码 dcg/ 与 dcg/jx/</w:t>
       </w:r>
     </w:p>
     <w:p>
+      <w:pPr>
+        <w:pStyle w:val="ListBullet"/>
+      </w:pPr>
       <w:r>
-        <w:t>单元测试：tests/**</w:t>
+        <w:t>单测 tests/</w:t>
       </w:r>
     </w:p>
     <w:p>
+      <w:pPr>
+        <w:pStyle w:val="ListBullet"/>
+      </w:pPr>
       <w:r>
-        <w:t>验收测试：evidence/accept.py</w:t>
+        <w:t>独立验收 evidence/</w:t>
       </w:r>
     </w:p>
     <w:p>
+      <w:pPr>
+        <w:pStyle w:val="ListBullet"/>
+      </w:pPr>
       <w:r>
-        <w:t>历史样本与旧证据：bench/**、evidence/**（只读归档）</w:t>
+        <w:t>基准 bench/</w:t>
       </w:r>
     </w:p>
     <w:p>
+      <w:pPr>
+        <w:pStyle w:val="ListBullet"/>
+      </w:pPr>
       <w:r>
-        <w:t>产物目录：dist/</w:t>
+        <w:t>档案 协作/（含 24-证据/、归档/、模板/）</w:t>
       </w:r>
     </w:p>
     <w:p>
@@ -250,33 +269,35 @@
       </w:r>
     </w:p>
     <w:p>
+      <w:pPr>
+        <w:pStyle w:val="ListBullet"/>
+      </w:pPr>
       <w:r>
-        <w:t>改动来源：git（提交作者用于 G1 归因）</w:t>
+        <w:t>改动来源：git；提交作者与提交号是 G1 的归因依据</w:t>
       </w:r>
     </w:p>
     <w:p>
+      <w:pPr>
+        <w:pStyle w:val="ListBullet"/>
+      </w:pPr>
       <w:r>
-        <w:t>启用门禁：G0 完整性、G1 权限与篡改、G6 验收；其余随阶段启用</w:t>
+        <w:t>门禁：G0–G8 全部启用（固定项，不填不选）</w:t>
       </w:r>
     </w:p>
     <w:p>
+      <w:pPr>
+        <w:pStyle w:val="ListBullet"/>
+      </w:pPr>
       <w:r>
-        <w:t>审查轮次上限：3（从账本复算）</w:t>
+        <w:t>审查轮次上限：3（同一交付物超过 3 轮仍 CHANGES_REQUESTED 必须升级为风险或缺陷）</w:t>
       </w:r>
     </w:p>
     <w:p>
+      <w:pPr>
+        <w:pStyle w:val="ListBullet"/>
+      </w:pPr>
       <w:r>
-        <w:t>专项类别：安全 / 性能 / 供应链</w:t>
-      </w:r>
-    </w:p>
-    <w:p>
-      <w:r>
-        <w:t>严格职责分离：是（单人档位，评审需独立一轮）</w:t>
-      </w:r>
-    </w:p>
-    <w:p>
-      <w:r>
-        <w:t>文档类切片豁免：见账本第 5 行（豁免 G4/G5，有效期至首个代码切片）</w:t>
+        <w:t>专项审查类别：安全 / 性能 / 供应链 / 兼容性 / 可运维性（与附件B 对齐）</w:t>
       </w:r>
     </w:p>
     <w:p>
@@ -284,12 +305,744 @@
         <w:pStyle w:val="Heading1"/>
       </w:pPr>
       <w:r>
-        <w:t>5. 中文名 → 英文别名（仅跨工具处理时用）</w:t>
+        <w:t>5. 九角色映射</w:t>
+      </w:r>
+    </w:p>
+    <w:tbl>
+      <w:tblPr>
+        <w:tblStyle w:val="TableGrid"/>
+        <w:tblW w:type="auto" w:w="0"/>
+        <w:tblLook w:firstColumn="1" w:firstRow="1" w:lastColumn="0" w:lastRow="0" w:noHBand="0" w:noVBand="1" w:val="04A0"/>
+      </w:tblPr>
+      <w:tblGrid>
+        <w:gridCol w:w="2160"/>
+        <w:gridCol w:w="2160"/>
+        <w:gridCol w:w="2160"/>
+        <w:gridCol w:w="2160"/>
+      </w:tblGrid>
+      <w:tr>
+        <w:tc>
+          <w:tcPr>
+            <w:tcW w:type="dxa" w:w="2160"/>
+          </w:tcPr>
+          <w:p>
+            <w:r>
+              <w:t>角色</w:t>
+            </w:r>
+          </w:p>
+        </w:tc>
+        <w:tc>
+          <w:tcPr>
+            <w:tcW w:type="dxa" w:w="2160"/>
+          </w:tcPr>
+          <w:p>
+            <w:r>
+              <w:t>承担人</w:t>
+            </w:r>
+          </w:p>
+        </w:tc>
+        <w:tc>
+          <w:tcPr>
+            <w:tcW w:type="dxa" w:w="2160"/>
+          </w:tcPr>
+          <w:p>
+            <w:r>
+              <w:t>独立评审方式</w:t>
+            </w:r>
+          </w:p>
+        </w:tc>
+        <w:tc>
+          <w:tcPr>
+            <w:tcW w:type="dxa" w:w="2160"/>
+          </w:tcPr>
+          <w:p>
+            <w:r>
+              <w:t>备注</w:t>
+            </w:r>
+          </w:p>
+        </w:tc>
+      </w:tr>
+      <w:tr>
+        <w:tc>
+          <w:tcPr>
+            <w:tcW w:type="dxa" w:w="2160"/>
+          </w:tcPr>
+          <w:p>
+            <w:r>
+              <w:t>负责人</w:t>
+            </w:r>
+          </w:p>
+        </w:tc>
+        <w:tc>
+          <w:tcPr>
+            <w:tcW w:type="dxa" w:w="2160"/>
+          </w:tcPr>
+          <w:p>
+            <w:r>
+              <w:t>guozhizhuang</w:t>
+            </w:r>
+          </w:p>
+        </w:tc>
+        <w:tc>
+          <w:tcPr>
+            <w:tcW w:type="dxa" w:w="2160"/>
+          </w:tcPr>
+          <w:p>
+            <w:r>
+              <w:t>不适用（最终验收由负责人签）</w:t>
+            </w:r>
+          </w:p>
+        </w:tc>
+        <w:tc>
+          <w:tcPr>
+            <w:tcW w:type="dxa" w:w="2160"/>
+          </w:tcPr>
+          <w:p>
+            <w:r>
+              <w:t>轮次上限 3</w:t>
+            </w:r>
+          </w:p>
+        </w:tc>
+      </w:tr>
+      <w:tr>
+        <w:tc>
+          <w:tcPr>
+            <w:tcW w:type="dxa" w:w="2160"/>
+          </w:tcPr>
+          <w:p>
+            <w:r>
+              <w:t>产品</w:t>
+            </w:r>
+          </w:p>
+        </w:tc>
+        <w:tc>
+          <w:tcPr>
+            <w:tcW w:type="dxa" w:w="2160"/>
+          </w:tcPr>
+          <w:p>
+            <w:r>
+              <w:t>guozhizhuang</w:t>
+            </w:r>
+          </w:p>
+        </w:tc>
+        <w:tc>
+          <w:tcPr>
+            <w:tcW w:type="dxa" w:w="2160"/>
+          </w:tcPr>
+          <w:p>
+            <w:r>
+              <w:t>不适用</w:t>
+            </w:r>
+          </w:p>
+        </w:tc>
+        <w:tc>
+          <w:tcPr>
+            <w:tcW w:type="dxa" w:w="2160"/>
+          </w:tcPr>
+          <w:p>
+            <w:r>
+              <w:t>契约与裁决</w:t>
+            </w:r>
+          </w:p>
+        </w:tc>
+      </w:tr>
+      <w:tr>
+        <w:tc>
+          <w:tcPr>
+            <w:tcW w:type="dxa" w:w="2160"/>
+          </w:tcPr>
+          <w:p>
+            <w:r>
+              <w:t>需求分析</w:t>
+            </w:r>
+          </w:p>
+        </w:tc>
+        <w:tc>
+          <w:tcPr>
+            <w:tcW w:type="dxa" w:w="2160"/>
+          </w:tcPr>
+          <w:p>
+            <w:r>
+              <w:t>guozhizhuang</w:t>
+            </w:r>
+          </w:p>
+        </w:tc>
+        <w:tc>
+          <w:tcPr>
+            <w:tcW w:type="dxa" w:w="2160"/>
+          </w:tcPr>
+          <w:p>
+            <w:r>
+              <w:t>不适用</w:t>
+            </w:r>
+          </w:p>
+        </w:tc>
+        <w:tc>
+          <w:tcPr>
+            <w:tcW w:type="dxa" w:w="2160"/>
+          </w:tcPr>
+          <w:p>
+            <w:r>
+              <w:t>规格与草稿</w:t>
+            </w:r>
+          </w:p>
+        </w:tc>
+      </w:tr>
+      <w:tr>
+        <w:tc>
+          <w:tcPr>
+            <w:tcW w:type="dxa" w:w="2160"/>
+          </w:tcPr>
+          <w:p>
+            <w:r>
+              <w:t>架构契约</w:t>
+            </w:r>
+          </w:p>
+        </w:tc>
+        <w:tc>
+          <w:tcPr>
+            <w:tcW w:type="dxa" w:w="2160"/>
+          </w:tcPr>
+          <w:p>
+            <w:r>
+              <w:t>guozhizhuang</w:t>
+            </w:r>
+          </w:p>
+        </w:tc>
+        <w:tc>
+          <w:tcPr>
+            <w:tcW w:type="dxa" w:w="2160"/>
+          </w:tcPr>
+          <w:p>
+            <w:r>
+              <w:t>不适用</w:t>
+            </w:r>
+          </w:p>
+        </w:tc>
+        <w:tc>
+          <w:tcPr>
+            <w:tcW w:type="dxa" w:w="2160"/>
+          </w:tcPr>
+          <w:p>
+            <w:r>
+              <w:t>设计/接口/数据模型/所有权</w:t>
+            </w:r>
+          </w:p>
+        </w:tc>
+      </w:tr>
+      <w:tr>
+        <w:tc>
+          <w:tcPr>
+            <w:tcW w:type="dxa" w:w="2160"/>
+          </w:tcPr>
+          <w:p>
+            <w:r>
+              <w:t>实现工程师</w:t>
+            </w:r>
+          </w:p>
+        </w:tc>
+        <w:tc>
+          <w:tcPr>
+            <w:tcW w:type="dxa" w:w="2160"/>
+          </w:tcPr>
+          <w:p>
+            <w:r>
+              <w:t>guozhizhuang</w:t>
+            </w:r>
+          </w:p>
+        </w:tc>
+        <w:tc>
+          <w:tcPr>
+            <w:tcW w:type="dxa" w:w="2160"/>
+          </w:tcPr>
+          <w:p>
+            <w:r>
+              <w:t>不适用</w:t>
+            </w:r>
+          </w:p>
+        </w:tc>
+        <w:tc>
+          <w:tcPr>
+            <w:tcW w:type="dxa" w:w="2160"/>
+          </w:tcPr>
+          <w:p>
+            <w:r>
+              <w:t>代码与单测</w:t>
+            </w:r>
+          </w:p>
+        </w:tc>
+      </w:tr>
+      <w:tr>
+        <w:tc>
+          <w:tcPr>
+            <w:tcW w:type="dxa" w:w="2160"/>
+          </w:tcPr>
+          <w:p>
+            <w:r>
+              <w:t>代码评审</w:t>
+            </w:r>
+          </w:p>
+        </w:tc>
+        <w:tc>
+          <w:tcPr>
+            <w:tcW w:type="dxa" w:w="2160"/>
+          </w:tcPr>
+          <w:p>
+            <w:r>
+              <w:t>guozhizhuang</w:t>
+            </w:r>
+          </w:p>
+        </w:tc>
+        <w:tc>
+          <w:tcPr>
+            <w:tcW w:type="dxa" w:w="2160"/>
+          </w:tcPr>
+          <w:p>
+            <w:r>
+              <w:t>独立复读：另一会话逐条读 diff 并按附件A 判定</w:t>
+            </w:r>
+          </w:p>
+        </w:tc>
+        <w:tc>
+          <w:tcPr>
+            <w:tcW w:type="dxa" w:w="2160"/>
+          </w:tcPr>
+          <w:p>
+            <w:r>
+              <w:t>与实现同人，必须独立一轮</w:t>
+            </w:r>
+          </w:p>
+        </w:tc>
+      </w:tr>
+      <w:tr>
+        <w:tc>
+          <w:tcPr>
+            <w:tcW w:type="dxa" w:w="2160"/>
+          </w:tcPr>
+          <w:p>
+            <w:r>
+              <w:t>专项评审</w:t>
+            </w:r>
+          </w:p>
+        </w:tc>
+        <w:tc>
+          <w:tcPr>
+            <w:tcW w:type="dxa" w:w="2160"/>
+          </w:tcPr>
+          <w:p>
+            <w:r>
+              <w:t>guozhizhuang</w:t>
+            </w:r>
+          </w:p>
+        </w:tc>
+        <w:tc>
+          <w:tcPr>
+            <w:tcW w:type="dxa" w:w="2160"/>
+          </w:tcPr>
+          <w:p>
+            <w:r>
+              <w:t>独立复读：按附件B 逐条判定</w:t>
+            </w:r>
+          </w:p>
+        </w:tc>
+        <w:tc>
+          <w:tcPr>
+            <w:tcW w:type="dxa" w:w="2160"/>
+          </w:tcPr>
+          <w:p>
+            <w:r>
+              <w:t>同上</w:t>
+            </w:r>
+          </w:p>
+        </w:tc>
+      </w:tr>
+      <w:tr>
+        <w:tc>
+          <w:tcPr>
+            <w:tcW w:type="dxa" w:w="2160"/>
+          </w:tcPr>
+          <w:p>
+            <w:r>
+              <w:t>测试验证</w:t>
+            </w:r>
+          </w:p>
+        </w:tc>
+        <w:tc>
+          <w:tcPr>
+            <w:tcW w:type="dxa" w:w="2160"/>
+          </w:tcPr>
+          <w:p>
+            <w:r>
+              <w:t>guozhizhuang</w:t>
+            </w:r>
+          </w:p>
+        </w:tc>
+        <w:tc>
+          <w:tcPr>
+            <w:tcW w:type="dxa" w:w="2160"/>
+          </w:tcPr>
+          <w:p>
+            <w:r>
+              <w:t>独立复跑：命令在干净环境重跑并比对退出码</w:t>
+            </w:r>
+          </w:p>
+        </w:tc>
+        <w:tc>
+          <w:tcPr>
+            <w:tcW w:type="dxa" w:w="2160"/>
+          </w:tcPr>
+          <w:p>
+            <w:r>
+              <w:t>同上</w:t>
+            </w:r>
+          </w:p>
+        </w:tc>
+      </w:tr>
+      <w:tr>
+        <w:tc>
+          <w:tcPr>
+            <w:tcW w:type="dxa" w:w="2160"/>
+          </w:tcPr>
+          <w:p>
+            <w:r>
+              <w:t>集成发布</w:t>
+            </w:r>
+          </w:p>
+        </w:tc>
+        <w:tc>
+          <w:tcPr>
+            <w:tcW w:type="dxa" w:w="2160"/>
+          </w:tcPr>
+          <w:p>
+            <w:r>
+              <w:t>guozhizhuang</w:t>
+            </w:r>
+          </w:p>
+        </w:tc>
+        <w:tc>
+          <w:tcPr>
+            <w:tcW w:type="dxa" w:w="2160"/>
+          </w:tcPr>
+          <w:p>
+            <w:r>
+              <w:t>不适用</w:t>
+            </w:r>
+          </w:p>
+        </w:tc>
+        <w:tc>
+          <w:tcPr>
+            <w:tcW w:type="dxa" w:w="2160"/>
+          </w:tcPr>
+          <w:p>
+            <w:r>
+              <w:t>集成/发布/账本</w:t>
+            </w:r>
+          </w:p>
+        </w:tc>
+      </w:tr>
+    </w:tbl>
+    <w:p>
+      <w:pPr>
+        <w:pStyle w:val="Heading1"/>
+      </w:pPr>
+      <w:r>
+        <w:t>6. 中文名→英文别名</w:t>
       </w:r>
     </w:p>
     <w:p>
       <w:r>
-        <w:t>切片ID → slice_id；验收标准ID → acceptance_id；契约ID → contract_id；证据编号 → evidence_id；改动编号 → change_id</w:t>
+        <w:t>交付物与字段以中文名称为准；英文键只是可选别名，仅在需要对接外部工具时使用。</w:t>
+      </w:r>
+    </w:p>
+    <w:tbl>
+      <w:tblPr>
+        <w:tblStyle w:val="TableGrid"/>
+        <w:tblW w:type="auto" w:w="0"/>
+        <w:tblLook w:firstColumn="1" w:firstRow="1" w:lastColumn="0" w:lastRow="0" w:noHBand="0" w:noVBand="1" w:val="04A0"/>
+      </w:tblPr>
+      <w:tblGrid>
+        <w:gridCol w:w="2880"/>
+        <w:gridCol w:w="2880"/>
+        <w:gridCol w:w="2880"/>
+      </w:tblGrid>
+      <w:tr>
+        <w:tc>
+          <w:tcPr>
+            <w:tcW w:type="dxa" w:w="2880"/>
+          </w:tcPr>
+          <w:p>
+            <w:r>
+              <w:t>中文名</w:t>
+            </w:r>
+          </w:p>
+        </w:tc>
+        <w:tc>
+          <w:tcPr>
+            <w:tcW w:type="dxa" w:w="2880"/>
+          </w:tcPr>
+          <w:p>
+            <w:r>
+              <w:t>英文别名</w:t>
+            </w:r>
+          </w:p>
+        </w:tc>
+        <w:tc>
+          <w:tcPr>
+            <w:tcW w:type="dxa" w:w="2880"/>
+          </w:tcPr>
+          <w:p>
+            <w:r>
+              <w:t>出现位置</w:t>
+            </w:r>
+          </w:p>
+        </w:tc>
+      </w:tr>
+      <w:tr>
+        <w:tc>
+          <w:tcPr>
+            <w:tcW w:type="dxa" w:w="2880"/>
+          </w:tcPr>
+          <w:p>
+            <w:r>
+              <w:t>契约ID</w:t>
+            </w:r>
+          </w:p>
+        </w:tc>
+        <w:tc>
+          <w:tcPr>
+            <w:tcW w:type="dxa" w:w="2880"/>
+          </w:tcPr>
+          <w:p>
+            <w:r>
+              <w:t>contract_id</w:t>
+            </w:r>
+          </w:p>
+        </w:tc>
+        <w:tc>
+          <w:tcPr>
+            <w:tcW w:type="dxa" w:w="2880"/>
+          </w:tcPr>
+          <w:p>
+            <w:r>
+              <w:t>07/09</w:t>
+            </w:r>
+          </w:p>
+        </w:tc>
+      </w:tr>
+      <w:tr>
+        <w:tc>
+          <w:tcPr>
+            <w:tcW w:type="dxa" w:w="2880"/>
+          </w:tcPr>
+          <w:p>
+            <w:r>
+              <w:t>验收标准ID</w:t>
+            </w:r>
+          </w:p>
+        </w:tc>
+        <w:tc>
+          <w:tcPr>
+            <w:tcW w:type="dxa" w:w="2880"/>
+          </w:tcPr>
+          <w:p>
+            <w:r>
+              <w:t>acceptance_id</w:t>
+            </w:r>
+          </w:p>
+        </w:tc>
+        <w:tc>
+          <w:tcPr>
+            <w:tcW w:type="dxa" w:w="2880"/>
+          </w:tcPr>
+          <w:p>
+            <w:r>
+              <w:t>07/20</w:t>
+            </w:r>
+          </w:p>
+        </w:tc>
+      </w:tr>
+      <w:tr>
+        <w:tc>
+          <w:tcPr>
+            <w:tcW w:type="dxa" w:w="2880"/>
+          </w:tcPr>
+          <w:p>
+            <w:r>
+              <w:t>切片ID</w:t>
+            </w:r>
+          </w:p>
+        </w:tc>
+        <w:tc>
+          <w:tcPr>
+            <w:tcW w:type="dxa" w:w="2880"/>
+          </w:tcPr>
+          <w:p>
+            <w:r>
+              <w:t>slice_id</w:t>
+            </w:r>
+          </w:p>
+        </w:tc>
+        <w:tc>
+          <w:tcPr>
+            <w:tcW w:type="dxa" w:w="2880"/>
+          </w:tcPr>
+          <w:p>
+            <w:r>
+              <w:t>02/03/04</w:t>
+            </w:r>
+          </w:p>
+        </w:tc>
+      </w:tr>
+      <w:tr>
+        <w:tc>
+          <w:tcPr>
+            <w:tcW w:type="dxa" w:w="2880"/>
+          </w:tcPr>
+          <w:p>
+            <w:r>
+              <w:t>改动编号</w:t>
+            </w:r>
+          </w:p>
+        </w:tc>
+        <w:tc>
+          <w:tcPr>
+            <w:tcW w:type="dxa" w:w="2880"/>
+          </w:tcPr>
+          <w:p>
+            <w:r>
+              <w:t>change_id</w:t>
+            </w:r>
+          </w:p>
+        </w:tc>
+        <w:tc>
+          <w:tcPr>
+            <w:tcW w:type="dxa" w:w="2880"/>
+          </w:tcPr>
+          <w:p>
+            <w:r>
+              <w:t>14</w:t>
+            </w:r>
+          </w:p>
+        </w:tc>
+      </w:tr>
+      <w:tr>
+        <w:tc>
+          <w:tcPr>
+            <w:tcW w:type="dxa" w:w="2880"/>
+          </w:tcPr>
+          <w:p>
+            <w:r>
+              <w:t>证据</w:t>
+            </w:r>
+          </w:p>
+        </w:tc>
+        <w:tc>
+          <w:tcPr>
+            <w:tcW w:type="dxa" w:w="2880"/>
+          </w:tcPr>
+          <w:p>
+            <w:r>
+              <w:t>evidence</w:t>
+            </w:r>
+          </w:p>
+        </w:tc>
+        <w:tc>
+          <w:tcPr>
+            <w:tcW w:type="dxa" w:w="2880"/>
+          </w:tcPr>
+          <w:p>
+            <w:r>
+              <w:t>24</w:t>
+            </w:r>
+          </w:p>
+        </w:tc>
+      </w:tr>
+      <w:tr>
+        <w:tc>
+          <w:tcPr>
+            <w:tcW w:type="dxa" w:w="2880"/>
+          </w:tcPr>
+          <w:p>
+            <w:r>
+              <w:t>账本</w:t>
+            </w:r>
+          </w:p>
+        </w:tc>
+        <w:tc>
+          <w:tcPr>
+            <w:tcW w:type="dxa" w:w="2880"/>
+          </w:tcPr>
+          <w:p>
+            <w:r>
+              <w:t>ledger</w:t>
+            </w:r>
+          </w:p>
+        </w:tc>
+        <w:tc>
+          <w:tcPr>
+            <w:tcW w:type="dxa" w:w="2880"/>
+          </w:tcPr>
+          <w:p>
+            <w:r>
+              <w:t>25</w:t>
+            </w:r>
+          </w:p>
+        </w:tc>
+      </w:tr>
+      <w:tr>
+        <w:tc>
+          <w:tcPr>
+            <w:tcW w:type="dxa" w:w="2880"/>
+          </w:tcPr>
+          <w:p>
+            <w:r>
+              <w:t>提交号</w:t>
+            </w:r>
+          </w:p>
+        </w:tc>
+        <w:tc>
+          <w:tcPr>
+            <w:tcW w:type="dxa" w:w="2880"/>
+          </w:tcPr>
+          <w:p>
+            <w:r>
+              <w:t>commit</w:t>
+            </w:r>
+          </w:p>
+        </w:tc>
+        <w:tc>
+          <w:tcPr>
+            <w:tcW w:type="dxa" w:w="2880"/>
+          </w:tcPr>
+          <w:p>
+            <w:r>
+              <w:t>14/22/27/37</w:t>
+            </w:r>
+          </w:p>
+        </w:tc>
+      </w:tr>
+    </w:tbl>
+    <w:p>
+      <w:pPr>
+        <w:pStyle w:val="Heading1"/>
+      </w:pPr>
+      <w:r>
+        <w:t>7. 全开声明</w:t>
+      </w:r>
+    </w:p>
+    <w:p>
+      <w:r>
+        <w:t>本仓库按 v3.5 全开运行：37 份编号交付物 + 3 份附件清单全部必需，40 份模板一次性铺满；不存在「档位」「门禁开关」「可选交付物」。</w:t>
+      </w:r>
+    </w:p>
+    <w:p>
+      <w:r>
+        <w:t>任何偏离只能作为例外写入账本（责任人 + 理由 + 关闭条件），且必须在 G8 之前关闭。</w:t>
+      </w:r>
+    </w:p>
+    <w:p>
+      <w:r>
+        <w:t>上一版（v3.4）的「单人档位」「P0 只启 G0/G1/G6」「文档类切片豁免 G4/G5」「P0 最小集差异声明」全部作废，见 29-变更记录 变更-0004。</w:t>
       </w:r>
     </w:p>
     <w:p>
@@ -297,22 +1050,12 @@
         <w:pStyle w:val="Heading1"/>
       </w:pPr>
       <w:r>
-        <w:t>6. 本仓库差异声明</w:t>
+        <w:t>8. 证据指针</w:t>
       </w:r>
     </w:p>
     <w:p>
       <w:r>
-        <w:t>P0 阶段必需交付物按最小集判定：01/02/04/05/07/09/13/14/15/20/24/25 + 附件A/B/C；</w:t>
-      </w:r>
-    </w:p>
-    <w:p>
-      <w:r>
-        <w:t>06/08/10/11/12/16/17/18/19/21/22/23 在首个代码切片前补齐（届时按 §3 全量核对）。</w:t>
-      </w:r>
-    </w:p>
-    <w:p>
-      <w:r>
-        <w:t>本声明与 TEAMODEL.md 冲突时以本声明为准（TEAMODEL §15 允许项目在附录声明差异）。</w:t>
+        <w:t>证据-0008（协议 v3.5 一致性校验）、证据-0009（37+3 交付物齐全）、证据-0011（pytest 696 + accept 16 PASS）。</w:t>
       </w:r>
     </w:p>
     <w:sectPr>
@@ -688,10 +1431,6 @@
     <w:name w:val="Normal"/>
     <w:qFormat/>
     <w:rsid w:val="00FC693F"/>
-    <w:rPr>
-      <w:rFonts w:ascii="微软雅黑" w:hAnsi="微软雅黑" w:eastAsia="微软雅黑"/>
-      <w:sz w:val="21"/>
-    </w:rPr>
   </w:style>
   <w:style w:type="paragraph" w:styleId="Header">
     <w:name w:val="header"/>

</xml_diff>

<commit_message>
chore(tm): move the protocol and templates to the TEAMODEL repo, DCG keeps only its own records
</commit_message>
<xml_diff>
--- a/协作/01-项目画像.docx
+++ b/协作/01-项目画像.docx
@@ -257,7 +257,7 @@
         <w:pStyle w:val="ListBullet"/>
       </w:pPr>
       <w:r>
-        <w:t>档案 协作/（含 24-证据/、归档/、模板/）</w:t>
+        <w:t>档案 协作/（含 24-证据/、归档/）；模板为本地缓存（协作/模板/，.gitignore 排除、不入库）</w:t>
       </w:r>
     </w:p>
     <w:p>
@@ -1058,6 +1058,25 @@
         <w:t>证据-0008（协议 v3.5 一致性校验）、证据-0009（37+3 交付物齐全）、证据-0011（pytest 696 + accept 16 PASS）。</w:t>
       </w:r>
     </w:p>
+    <w:p/>
+    <w:p>
+      <w:r>
+        <w:rPr>
+          <w:b/>
+        </w:rPr>
+        <w:t>9. 协议与模板来源</w:t>
+      </w:r>
+    </w:p>
+    <w:p>
+      <w:r>
+        <w:t>协议：TEAMODEL 仓库 https://github.com/CL98K/TEAMODEL.git，版本 v3.5.1，标签 tm-v3.5.1（提交 a3850b9）。本仓库版本库不保存协议与模板副本；协作/模板/ 仅为本地缓存（.gitignore 排除）。协议升版需更新本节的版本号与标签，并记一条变更记录。</w:t>
+      </w:r>
+    </w:p>
+    <w:p>
+      <w:r>
+        <w:t>协议仓库目录：TEAMODEL.md（协议全文）、模板/（40 份骨架）、样例/（真实样例）、历史/（v1 草稿）、CHANGELOG.md。</w:t>
+      </w:r>
+    </w:p>
     <w:sectPr>
       <w:pgSz w:w="12240" w:h="15840"/>
       <w:pgMar w:top="1440" w:right="1800" w:bottom="1440" w:left="1800" w:header="720" w:footer="720" w:gutter="0"/>

</xml_diff>